<commit_message>
docs: restructure permissions, add logging and architecture panorama
</commit_message>
<xml_diff>
--- a/output/doc/开题报告-基于大语言模型的智能医疗辅助问诊系统-模板版.docx
+++ b/output/doc/开题报告-基于大语言模型的智能医疗辅助问诊系统-模板版.docx
@@ -110,13 +110,25 @@
               </w:rPr>
               <w:t>国外在医疗AI领域已从规则系统逐步发展到“LLM + RAG”方案，重点关注回答依据可解释、风险内容约束和临床流程协同。国内研究则更注重与医院实际业务的融合，尤其在导诊分流、病历结构化和互联网问诊方面发展迅速。</w:t>
             </w:r>
+            <w:bookmarkStart w:id="0" w:name="_GoBack"/>
+            <w:bookmarkEnd w:id="0"/>
           </w:p>
           <w:p>
             <w:pPr>
               <w:ind w:firstLine="420"/>
             </w:pPr>
             <w:r>
-              <w:t>现有方案的共性问题主要包括：医疗知识更新成本高、模型幻觉带来的安全风险、以及业务系统与AI能力耦合过重导致的工程落地困难。因此，本课题以“业务闭环 + 可追溯检索 + 安全护栏 + 排班优化”为主线，构建Java业务主服务与Python AI微服务协同架构，实现患者、医生、管理员三类角色的核心流程贯通。</w:t>
+              <w:t>现有方案的共性问题主要包括：医疗知识更新成本高、模型幻觉带来的安全风险、以及业务系统与AI能力耦合过重导致的工程落地困难。因此，本课题以“业务闭环 + 可追溯检索 + 安全护栏 + 排班优化”为主线，构建Java业务主服务与Python AI微服务协同架构，实现患者、医生、管理员三类角色的核心流程贯通</w:t>
+            </w:r>
+            <w:r>
+              <w:rPr>
+                <w:rFonts w:hint="eastAsia"/>
+                <w:lang w:val="en-US" w:eastAsia="zh-CN"/>
+              </w:rPr>
+              <w:t>同时保留可扩展性以支持后续更复杂的权限和资源管理控制</w:t>
+            </w:r>
+            <w:r>
+              <w:t>。</w:t>
             </w:r>
           </w:p>
           <w:p>
@@ -562,15 +574,7 @@
               <w:rPr>
                 <w:rFonts w:hint="eastAsia"/>
               </w:rPr>
-              <w:t>2</w:t>
-            </w:r>
-            <w:bookmarkStart w:id="0" w:name="_GoBack"/>
-            <w:bookmarkEnd w:id="0"/>
-            <w:r>
-              <w:rPr>
-                <w:rFonts w:hint="eastAsia"/>
-              </w:rPr>
-              <w:t xml:space="preserve">026/02/13—2026/02/28：完成文献研读、需求梳理与开题报告定稿； </w:t>
+              <w:t xml:space="preserve">2026/02/13—2026/02/28：完成文献研读、需求梳理与开题报告定稿； </w:t>
             </w:r>
           </w:p>
           <w:p>

</xml_diff>